<commit_message>
réglages et mise à jour
</commit_message>
<xml_diff>
--- a/rapport-de-stage/Rapport_de_Stage_ArchiVision_KB_Group_ameliore.docx
+++ b/rapport-de-stage/Rapport_de_Stage_ArchiVision_KB_Group_ameliore.docx
@@ -160,7 +160,7 @@
           <w:sz w:val="24"/>
           <w:szCs w:val="24"/>
         </w:rPr>
-        <w:t xml:space="preserve">Stage effectué du </w:t>
+        <w:t>Stage effectué du 23 juillet 2026 au 4 septembre 2026 à Yaoundé, au sein de K&amp;B Group SARL</w:t>
       </w:r>
       <w:r>
         <w:rPr>
@@ -170,15 +170,13 @@
           <w:highlight w:val="yellow"/>
           <w:highlightCs w:val="yellow"/>
         </w:rPr>
-        <w:t xml:space="preserve">[date de début]</w:t>
-      </w:r>
-      <w:r>
-        <w:rPr>
-          <w:rFonts w:ascii="Times New Roman" w:cs="Times New Roman" w:eastAsia="Times New Roman" w:hAnsi="Times New Roman"/>
-          <w:sz w:val="24"/>
-          <w:szCs w:val="24"/>
-        </w:rPr>
-        <w:t xml:space="preserve"> au </w:t>
+      </w:r>
+      <w:r>
+        <w:rPr>
+          <w:rFonts w:ascii="Times New Roman" w:cs="Times New Roman" w:eastAsia="Times New Roman" w:hAnsi="Times New Roman"/>
+          <w:sz w:val="24"/>
+          <w:szCs w:val="24"/>
+        </w:rPr>
       </w:r>
       <w:r>
         <w:rPr>
@@ -188,15 +186,13 @@
           <w:highlight w:val="yellow"/>
           <w:highlightCs w:val="yellow"/>
         </w:rPr>
-        <w:t xml:space="preserve">[date de fin]</w:t>
-      </w:r>
-      <w:r>
-        <w:rPr>
-          <w:rFonts w:ascii="Times New Roman" w:cs="Times New Roman" w:eastAsia="Times New Roman" w:hAnsi="Times New Roman"/>
-          <w:sz w:val="24"/>
-          <w:szCs w:val="24"/>
-        </w:rPr>
-        <w:t xml:space="preserve"> à Yaoundé, au sein de K&amp;B Group SARL</w:t>
+      </w:r>
+      <w:r>
+        <w:rPr>
+          <w:rFonts w:ascii="Times New Roman" w:cs="Times New Roman" w:eastAsia="Times New Roman" w:hAnsi="Times New Roman"/>
+          <w:sz w:val="24"/>
+          <w:szCs w:val="24"/>
+        </w:rPr>
       </w:r>
     </w:p>
     <w:p>
@@ -210,7 +206,7 @@
           <w:sz w:val="24"/>
           <w:szCs w:val="24"/>
         </w:rPr>
-        <w:t xml:space="preserve">En vue de l’obtention du </w:t>
+        <w:t>En vue de l’obtention du Diplôme d’Ingénieur de Conception en Informatique</w:t>
       </w:r>
       <w:r>
         <w:rPr>
@@ -220,7 +216,6 @@
           <w:highlight w:val="yellow"/>
           <w:highlightCs w:val="yellow"/>
         </w:rPr>
-        <w:t xml:space="preserve">[Diplôme d’Ingénieur de Conception en Informatique]</w:t>
       </w:r>
     </w:p>
     <w:p>
@@ -274,7 +269,7 @@
           <w:highlight w:val="yellow"/>
           <w:highlightCs w:val="yellow"/>
         </w:rPr>
-        <w:t xml:space="preserve">[NOM Prénoms]</w:t>
+        <w:t>KOUBISSACK Lucienne</w:t>
       </w:r>
     </w:p>
     <w:p>
@@ -459,7 +454,7 @@
           <w:highlight w:val="yellow"/>
           <w:highlightCs w:val="yellow"/>
         </w:rPr>
-        <w:t xml:space="preserve">[Année Académique, ex. 2025-2026]</w:t>
+        <w:t>2025-2026</w:t>
       </w:r>
     </w:p>
     <w:p>
@@ -2354,7 +2349,7 @@
           <w:sz w:val="24"/>
           <w:szCs w:val="24"/>
         </w:rPr>
-        <w:t xml:space="preserve">C’est dans ce contexte que s’inscrit notre stage académique de fin de cycle Ingénieur 4, effectué du </w:t>
+        <w:t>C’est dans ce contexte que s’inscrit notre stage académique de fin de cycle Ingénieur 4, effectué du 23 juillet 2026 au 4 septembre 2026 au sein de K&amp;B Group SARL, entreprise camerounaise spécialisée dans le développement des compétences, l’accompagnement organisationnel et l’innovation digitale, à travers son pôle K&amp;B Digital Lab.</w:t>
       </w:r>
       <w:r>
         <w:rPr>
@@ -2364,15 +2359,13 @@
           <w:highlight w:val="yellow"/>
           <w:highlightCs w:val="yellow"/>
         </w:rPr>
-        <w:t xml:space="preserve">[date de début]</w:t>
-      </w:r>
-      <w:r>
-        <w:rPr>
-          <w:rFonts w:ascii="Times New Roman" w:cs="Times New Roman" w:eastAsia="Times New Roman" w:hAnsi="Times New Roman"/>
-          <w:sz w:val="24"/>
-          <w:szCs w:val="24"/>
-        </w:rPr>
-        <w:t xml:space="preserve"> au </w:t>
+      </w:r>
+      <w:r>
+        <w:rPr>
+          <w:rFonts w:ascii="Times New Roman" w:cs="Times New Roman" w:eastAsia="Times New Roman" w:hAnsi="Times New Roman"/>
+          <w:sz w:val="24"/>
+          <w:szCs w:val="24"/>
+        </w:rPr>
       </w:r>
       <w:r>
         <w:rPr>
@@ -2382,15 +2375,13 @@
           <w:highlight w:val="yellow"/>
           <w:highlightCs w:val="yellow"/>
         </w:rPr>
-        <w:t xml:space="preserve">[date de fin]</w:t>
-      </w:r>
-      <w:r>
-        <w:rPr>
-          <w:rFonts w:ascii="Times New Roman" w:cs="Times New Roman" w:eastAsia="Times New Roman" w:hAnsi="Times New Roman"/>
-          <w:sz w:val="24"/>
-          <w:szCs w:val="24"/>
-        </w:rPr>
-        <w:t xml:space="preserve"> au sein de K&amp;B Group SARL, entreprise camerounaise spécialisée dans le développement des compétences, l’accompagnement organisationnel et l’innovation digitale, à travers son pôle K&amp;B Digital Lab.</w:t>
+      </w:r>
+      <w:r>
+        <w:rPr>
+          <w:rFonts w:ascii="Times New Roman" w:cs="Times New Roman" w:eastAsia="Times New Roman" w:hAnsi="Times New Roman"/>
+          <w:sz w:val="24"/>
+          <w:szCs w:val="24"/>
+        </w:rPr>
       </w:r>
     </w:p>
     <w:p>
@@ -3662,7 +3653,7 @@
           <w:sz w:val="24"/>
           <w:szCs w:val="24"/>
         </w:rPr>
-        <w:t xml:space="preserve">L’équipe technique au sein de laquelle nous avons évolué se compose de </w:t>
+        <w:t>Le développement technique de la plateforme ArchiVision a été mené en autonomie, au sein de l’équipe K&amp;B Digital Lab, sous la supervision directe de notre encadrant professionnel, avec des points de suivi réguliers pour valider les orientations fonctionnelles et techniques.</w:t>
       </w:r>
       <w:r>
         <w:rPr>
@@ -3672,7 +3663,6 @@
           <w:highlight w:val="yellow"/>
           <w:highlightCs w:val="yellow"/>
         </w:rPr>
-        <w:t xml:space="preserve">[description de l’équipe : nombre de personnes, rôles]</w:t>
       </w:r>
     </w:p>
     <w:p>
@@ -3878,6 +3868,17 @@
       </w:pPr>
       <w:r>
         <w:t>la rédaction et la mise à jour continue de la documentation technique du projet.</w:t>
+      </w:r>
+    </w:p>
+    <w:p>
+      <w:pPr>
+        <w:pStyle w:val="ListParagraph"/>
+        <w:spacing w:after="0" w:before="0" w:line="276" w:lineRule="auto"/>
+        <w:ind w:firstLine="567"/>
+        <w:jc w:val="both"/>
+      </w:pPr>
+      <w:r>
+        <w:t>la mise en place d’un flux de réinitialisation de mot de passe par e-mail (jeton à usage unique, empreinte SHA-256 seule stockée, expiration d’une heure, message de confirmation identique que le compte existe ou non pour ne jamais révéler les adresses enregistrées), pour qu’aucun compte, y compris administrateur, ne reste durablement bloqué en cas de mot de passe oublié ;</w:t>
       </w:r>
     </w:p>
     <w:p>
@@ -4737,6 +4738,45 @@
     </w:p>
     <w:p>
       <w:pPr>
+        <w:jc w:val="center"/>
+      </w:pPr>
+      <w:r>
+        <w:drawing>
+          <wp:inline xmlns:a="http://schemas.openxmlformats.org/drawingml/2006/main" xmlns:pic="http://schemas.openxmlformats.org/drawingml/2006/picture">
+            <wp:extent cx="5760720" cy="3145656"/>
+            <wp:docPr id="2" name="Picture 2"/>
+            <wp:cNvGraphicFramePr>
+              <a:graphicFrameLocks noChangeAspect="1"/>
+            </wp:cNvGraphicFramePr>
+            <a:graphic>
+              <a:graphicData uri="http://schemas.openxmlformats.org/drawingml/2006/picture">
+                <pic:pic>
+                  <pic:nvPicPr>
+                    <pic:cNvPr id="0" name="figure2_modele_donnees.png"/>
+                    <pic:cNvPicPr/>
+                  </pic:nvPicPr>
+                  <pic:blipFill>
+                    <a:blip r:embed="rId11"/>
+                    <a:stretch>
+                      <a:fillRect/>
+                    </a:stretch>
+                  </pic:blipFill>
+                  <pic:spPr>
+                    <a:xfrm>
+                      <a:off x="0" y="0"/>
+                      <a:ext cx="5760720" cy="3145656"/>
+                    </a:xfrm>
+                    <a:prstGeom prst="rect"/>
+                  </pic:spPr>
+                </pic:pic>
+              </a:graphicData>
+            </a:graphic>
+          </wp:inline>
+        </w:drawing>
+      </w:r>
+    </w:p>
+    <w:p>
+      <w:pPr>
         <w:spacing w:after="200" w:before="200"/>
         <w:jc w:val="center"/>
       </w:pPr>
@@ -4748,7 +4788,7 @@
           <w:highlight w:val="yellow"/>
           <w:highlightCs w:val="yellow"/>
         </w:rPr>
-        <w:t xml:space="preserve">[Figure 2 : Modèle de données (schéma entité-association) du référentiel ArchiVision — à insérer (export du schéma Prisma)]</w:t>
+        <w:t>Figure 2 : Modèle de données (schéma entité-association simplifié) du référentiel ArchiVision.</w:t>
       </w:r>
     </w:p>
     <w:p>
@@ -5528,7 +5568,7 @@
           <w:rFonts w:ascii="Times New Roman" w:hAnsi="Times New Roman"/>
           <w:sz w:val="24"/>
         </w:rPr>
-        <w:t>La fiabilité de la solution est garantie par une couverture de tests automatisés (plus de 500 tests côté API avec Jest et Supertest, répartis sur une soixantaine de suites ; plus de 160 tests côté frontend Angular avec Jasmine et Karma), rejouée automatiquement par une intégration continue (GitHub Actions) à chaque modification du dépôt. Le tableau ci-dessous en résume la portée par grand domaine.</w:t>
+        <w:t>La fiabilité de la solution est garantie par une couverture de tests automatisés (562 tests côté API avec Jest et Supertest, répartis sur 66 suites ; 178 tests côté frontend Angular avec Jasmine et Karma), rejouée automatiquement par une intégration continue (GitHub Actions) à chaque modification du dépôt. Le tableau ci-dessous en résume la portée par grand domaine.</w:t>
       </w:r>
     </w:p>
     <w:tbl>
@@ -5869,6 +5909,20 @@
           <w:sz w:val="24"/>
         </w:rPr>
         <w:t>Plusieurs difficultés ont été rencontrées et surmontées durant le développement. La contrainte du référentiel métier à un nombre fixe de types d’éléments et de relations a nécessité une attention particulière lors de la conception du schéma de données et des règles de validation, afin d’empêcher toute dérive du modèle. La mise en œuvre d’une isolation multi-tenant réellement systématique, sur une vingtaine de modules développés au fil du stage, a demandé une discipline constante : chaque nouveau service devait vérifier explicitement l’appartenance organisationnelle de chaque ressource avant d’y accéder, un oubli isolé suffisant à ouvrir une fuite de données entre deux organisations. Un piège récurrent du framework NestJS a par ailleurs été rencontré à plusieurs reprises sur des contrôleurs distincts : une route déclarée littéralement (par exemple /solutions/gaps) doit impérativement être définie avant une route paramétrée de même préfixe (/solutions/:id), sans quoi la première est silencieusement interprétée comme une valeur du paramètre de la seconde. La conception du module d’analyse des écarts a également nécessité un travail de traduction de la matrice d’écarts TOGAF, décrite de façon abstraite dans la littérature, en un modèle de données concret capable de distinguer un élément conservé, éliminé, modifié ou nouveau entre l’état AS-IS et la cible TO-BE. Enfin, un audit de sécurité mené juste avant la mise en production a mis en évidence qu’une dépendance logicielle récemment ajoutée (bibliothèque d’envoi d’e-mails) comportait deux failles connues de sévérité haute, que le conteneur applicatif s’exécutait avec des privilèges administrateur superflus, et qu’une étape d’application des migrations de base de données manquait au processus de déploiement ; ces trois points ont été corrigés avant que la version ne soit considérée prête pour la production, ce qui illustre l’importance d’un audit de sécurité dédié, distinct de la seule vérification fonctionnelle.</w:t>
+      </w:r>
+    </w:p>
+    <w:p>
+      <w:pPr>
+        <w:spacing w:after="0" w:before="0" w:line="276" w:lineRule="auto"/>
+        <w:ind w:firstLine="567"/>
+        <w:jc w:val="both"/>
+      </w:pPr>
+      <w:r>
+        <w:rPr>
+          <w:rFonts w:ascii="Times New Roman" w:hAnsi="Times New Roman"/>
+          <w:sz w:val="24"/>
+        </w:rPr>
+        <w:t>Un second passage de durcissement, mené plus tard dans le stage à l’approche du déploiement, a révélé des angles morts différents mais du même ordre. L’image Docker de production embarquait encore, sans y avoir explicitement droit, les dépendances transitives d’un outil de développement (client en ligne de commande Prisma, jamais utilisé à l’exécution) : l’option --omit=dev seule ne suffit pas à écarter une dépendance marquée « optionnelle d’une dépendance de développement » dans le fichier de verrouillage npm ; il a fallu lui adjoindre --omit=optional. L’étape d’application des migrations de base de données, ajoutée au processus de déploiement pour corriger le manque relevé lors du premier audit, ne fonctionnait en réalité pas du tout : le fichier de configuration désormais requis par Prisma pour cette commande n’était jamais copié dans l’image. Enfin, une bibliothèque de traitement de fichiers Excel utilisée côté frontend s’est révélée porter deux vulnérabilités connues sans correctif disponible sur le registre npm public, le mainteneur ne distribuant ses versions corrigées que depuis son propre serveur. Ces trois points, une fois corrigés, ont été vérifiés de bout en bout en reconstruisant l’image de production et en rejouant l’ensemble des suites de tests.</w:t>
       </w:r>
     </w:p>
     <w:p>

</xml_diff>